<commit_message>
Add walking behaviour specification as veto (mandatory instruction)
- Walking behaviour specification in instruction_manual/ is the source of truth
- All implementations (testcases, ABM code) must follow it exactly
- Add VETO rule in CLAUDE.md: changes require explicit permission first
- Update all READMEs to reference specification and permission requirement
- Update instruction manual docx: remove 50-step references (testcase-specific)
- Emphasize that walking behaviour is fundamental and immutable without authorization
</commit_message>
<xml_diff>
--- a/instruction_manual/Agent_Walking_Pathfinding_Manual.docx
+++ b/instruction_manual/Agent_Walking_Pathfinding_Manual.docx
@@ -22,7 +22,7 @@
           <w:sz w:val="18"/>
           <w:szCs w:val="18"/>
         </w:rPr>
-        <w:t xml:space="preserve">Hoe een agent rationeel door de wereld beweegt. Dit één A4 beschrijft het volledige doel; geef het door om vanaf nul opnieuw te beginnen.</w:t>
+        <w:t xml:space="preserve">Hoe een agent rationeel door de wereld beweegt. Dit een A4 beschrijft het volledige doel; geef het door om vanaf nul opnieuw te beginnen.</w:t>
       </w:r>
     </w:p>
     <w:p>
@@ -30,7 +30,7 @@
         <w:pStyle w:val="Heading2"/>
       </w:pPr>
       <w:r>
-        <w:t xml:space="preserve">1. Doel in één zin</w:t>
+        <w:t xml:space="preserve">1. Doel in een zin</w:t>
       </w:r>
     </w:p>
     <w:p>
@@ -38,7 +38,7 @@
         <w:spacing w:after="60"/>
       </w:pPr>
       <w:r>
-        <w:t xml:space="preserve">Een externe functie bepaalt in welk domein de agent moet zijn. Elke step checkt de agent dat: is hij er nog niet, dan loopt hij via de gang naar dat domein (kortste pad als priority-queue, één cel per stap); is hij er wel, dan loopt hij wat rond (idle) of staat hij stil (working).</w:t>
+        <w:t xml:space="preserve">Een externe functie bepaalt in welk domein de agent moet zijn. Elke step checkt de agent dat: is hij er nog niet, dan loopt hij via de gang naar dat domein (kortste pad als priority-queue, een cel per stap); is hij er wel, dan loopt hij wat rond (idle) of staat hij stil (working).</w:t>
       </w:r>
     </w:p>
     <w:p>
@@ -74,7 +74,7 @@
           <w:sz w:val="19"/>
           <w:szCs w:val="19"/>
         </w:rPr>
-        <w:t xml:space="preserve">de ruimte waar de agent moet zijn. Wordt EXTERN gezet (andere module) en verandert zelden — minimaal elke 50 steps. De agent checkt elke step welk domein hij moet zijn; hij verandert dit zelf nooit.</w:t>
+        <w:t xml:space="preserve">de ruimte waar de agent moet zijn. Wordt EXTERN gezet (andere module). De agent checkt elke step welk domein hij moet zijn — het doel kan elke stap veranderen. Geen minimale stabiliteit; dat is testcase-specifiek voor controleerbaarheid.</w:t>
       </w:r>
     </w:p>
     <w:p>
@@ -147,7 +147,7 @@
           <w:sz w:val="19"/>
           <w:szCs w:val="19"/>
         </w:rPr>
-        <w:t xml:space="preserve">Pad = priority-queue: het hele pad van huidige cel naar doel wordt vooraf berekend als een wachtrij van cellen (front = volgende stap). De agent pakt elke step één cel van de voorkant.</w:t>
+        <w:t xml:space="preserve">Pad = priority-queue: het hele pad van huidige cel naar doel wordt vooraf berekend als een wachtrij van cellen (front = volgende stap). De agent pakt elke step een cel van de voorkant.</w:t>
       </w:r>
     </w:p>
     <w:p>
@@ -172,7 +172,7 @@
           <w:sz w:val="19"/>
           <w:szCs w:val="19"/>
         </w:rPr>
-        <w:t xml:space="preserve">Eén stap per step: elke beweging gaat naar een buurcel. Chebyshev-afstand tot de vorige cel is altijd ≤ 1. De agent mag NOOIT springen van het ene punt op de map naar het andere.</w:t>
+        <w:t xml:space="preserve">Een stap per step: elke beweging gaat naar een buurcel. Chebyshev-afstand tot de vorige cel is altijd &lt;= 1. De agent mag NOOIT springen van het ene punt op de map naar het andere.</w:t>
       </w:r>
     </w:p>
     <w:p>
@@ -366,7 +366,7 @@
                 <w:sz w:val="18"/>
                 <w:szCs w:val="18"/>
               </w:rPr>
-              <w:t xml:space="preserve">Elke step: zit ik in het doel-domein? Het doel komt van buiten en is ≥ 50 steps stabiel.</w:t>
+              <w:t xml:space="preserve">Elke step: zit ik in het doel-domein? Het doel komt van buiten; kan elke step veranderen.</w:t>
             </w:r>
           </w:p>
         </w:tc>
@@ -424,7 +424,7 @@
                 <w:sz w:val="18"/>
                 <w:szCs w:val="18"/>
               </w:rPr>
-              <w:t xml:space="preserve">Niet in doel-domein → plan/vervolg BFS-pad via de gang, loop één cel. Bij aankomst → idle of working.</w:t>
+              <w:t xml:space="preserve">Niet in doel-domein -&gt; plan/vervolg BFS-pad via de gang, loop een cel. Bij aankomst -&gt; idle of working.</w:t>
             </w:r>
           </w:p>
         </w:tc>
@@ -482,7 +482,7 @@
                 <w:sz w:val="18"/>
                 <w:szCs w:val="18"/>
               </w:rPr>
-              <w:t xml:space="preserve">In doel-domein, niks te doen → loop wat rond in de kamer (één cel per step).</w:t>
+              <w:t xml:space="preserve">In doel-domein, niks te doen -&gt; loop wat rond in de kamer (een cel per step).</w:t>
             </w:r>
           </w:p>
         </w:tc>
@@ -540,7 +540,7 @@
                 <w:sz w:val="18"/>
                 <w:szCs w:val="18"/>
               </w:rPr>
-              <w:t xml:space="preserve">In doel-domein → blijf staan waar je bent (geen beweging).</w:t>
+              <w:t xml:space="preserve">In doel-domein -&gt; blijf staan waar je bent (geen beweging).</w:t>
             </w:r>
           </w:p>
         </w:tc>
@@ -568,7 +568,7 @@
           <w:sz w:val="19"/>
           <w:szCs w:val="19"/>
         </w:rPr>
-        <w:t xml:space="preserve">Elke beweging heeft stap-afstand 1 (nul “jumps” over de hele run).</w:t>
+        <w:t xml:space="preserve">Elke beweging heeft stap-afstand 1 (nul jumps over de hele run).</w:t>
       </w:r>
     </w:p>
     <w:p>
@@ -602,7 +602,7 @@
           <w:sz w:val="19"/>
           <w:szCs w:val="19"/>
         </w:rPr>
-        <w:t xml:space="preserve">Doel-domein wordt alleen extern gezet, is ≥ 50 steps stabiel, en wordt elke step gecheckt.</w:t>
+        <w:t xml:space="preserve">Doel-domein wordt alleen extern gezet en wordt elke step gecheckt.</w:t>
       </w:r>
     </w:p>
     <w:p>
@@ -637,7 +637,7 @@
           <w:sz w:val="17"/>
           <w:szCs w:val="17"/>
         </w:rPr>
-        <w:t xml:space="preserve">Referentie-implementatie: testcases/html/walking_behaviour/index.html. Gevalideerd: 0 jumps, alle reizen via de gang, doel-domein ≥ 50 steps.</w:t>
+        <w:t xml:space="preserve">Referentie-implementatie: testcases/html/walking_behaviour/index.html. Gevalideerd: 0 jumps, alle reizen via de gang.</w:t>
       </w:r>
     </w:p>
     <w:sectPr>

</xml_diff>

<commit_message>
Keyboard env-camera controls + settings window, map layers
Env camera now drivable from the keyboard when the chat input is not
focused: arrow keys pan, 1/2 zoom in/out (alongside scroll). Clicking the
input line focuses it so arrows edit text instead; clicking/scrolling/
dragging the env releases focus. Zoom factors restepped to an even
1x/2.5x/4x for a deeper, uniform zoom.

Bundled WIP: settings window (SettingsWindow.cpp/.h), 3-layer map assets
(layer_1/2/3/5 pngs + archief/), map_generator + Agent/Buttons updates,
pygame llm_control sandbox.

Co-Authored-By: Claude Opus 4.8 <noreply@anthropic.com>
</commit_message>
<xml_diff>
--- a/instruction_manual/Agent_Walking_Pathfinding_Manual.docx
+++ b/instruction_manual/Agent_Walking_Pathfinding_Manual.docx
@@ -121,7 +121,7 @@
           <w:sz w:val="19"/>
           <w:szCs w:val="19"/>
         </w:rPr>
-        <w:t xml:space="preserve">Activiteit (3 soorten): </w:t>
+        <w:t xml:space="preserve">Activiteit (5 soorten): </w:t>
       </w:r>
       <w:r>
         <w:rPr>
@@ -130,7 +130,7 @@
           <w:sz w:val="19"/>
           <w:szCs w:val="19"/>
         </w:rPr>
-        <w:t xml:space="preserve">idle = niks te doen, loopt wat rond in zijn kamer; working = blijft staan waar hij is; move to domain = nog onderweg via de gang naar het doel-domein.</w:t>
+        <w:t xml:space="preserve">idle = niks te doen, loopt wat rond in zijn kamer; working / offline / standby = gedragen zich voorlopig als idle (lopen wat rond in de kamer); walking to a domain = nog onderweg via de gang naar het doel-domein.</w:t>
       </w:r>
     </w:p>
     <w:p>
@@ -396,7 +396,7 @@
                 <w:sz w:val="18"/>
                 <w:szCs w:val="18"/>
               </w:rPr>
-              <w:t xml:space="preserve">move to domain</w:t>
+              <w:t xml:space="preserve">walking to a domain</w:t>
             </w:r>
           </w:p>
         </w:tc>
@@ -619,7 +619,7 @@
           <w:sz w:val="19"/>
           <w:szCs w:val="19"/>
         </w:rPr>
-        <w:t xml:space="preserve">De drie activiteiten idle / working / move to domain gedragen zich correct.</w:t>
+        <w:t xml:space="preserve">De vijf activiteiten idle / working / offline / standby / walking to a domain gedragen zich correct (working/offline/standby gedragen zich voorlopig als idle).</w:t>
       </w:r>
     </w:p>
     <w:p>

</xml_diff>